<commit_message>
Membrete oficial (escudo, código de trámite, pie de página) en planeación y horas de gestión
Las plantillas no tenían el membrete real: encabezado con ADMINISTRACIÓN
MUNICIPAL, escudo, CÓDIGO/VERSIÓN del trámite, y el pie de página con la
web/dirección/correo. Se copió del Diario Pedagógico real (PC-PA-003-F03),
comparado documento a documento contra un ejemplo verdadero.

Horas de gestión usa el mismo escudo y pie de página, pero SIN código de
trámite: nunca existió un formato oficial real para eso, así que se dejó
esa columna afuera en vez de inventar un número. El armado del membrete
quedó compartido en scripts/_membrete_municipio.py — informe mensual
todavía no lo tiene, queda pendiente aparte.

El escudo es el escudo público del municipio (no dato personal de nadie),
por eso sí se versiona en templates/assets/, a diferencia de Estructura/.
</commit_message>
<xml_diff>
--- a/templates/informe_gestion.docx
+++ b/templates/informe_gestion.docx
@@ -2,19 +2,6 @@
 <file path=word/document.xml><?xml version="1.0" encoding="utf-8"?>
 <w:document xmlns:wpc="http://schemas.microsoft.com/office/word/2010/wordprocessingCanvas" xmlns:mo="http://schemas.microsoft.com/office/mac/office/2008/main" xmlns:mc="http://schemas.openxmlformats.org/markup-compatibility/2006" xmlns:mv="urn:schemas-microsoft-com:mac:vml" xmlns:o="urn:schemas-microsoft-com:office:office" xmlns:r="http://schemas.openxmlformats.org/officeDocument/2006/relationships" xmlns:m="http://schemas.openxmlformats.org/officeDocument/2006/math" xmlns:v="urn:schemas-microsoft-com:vml" xmlns:wp14="http://schemas.microsoft.com/office/word/2010/wordprocessingDrawing" xmlns:wp="http://schemas.openxmlformats.org/drawingml/2006/wordprocessingDrawing" xmlns:w10="urn:schemas-microsoft-com:office:word" xmlns:w="http://schemas.openxmlformats.org/wordprocessingml/2006/main" xmlns:w14="http://schemas.microsoft.com/office/word/2010/wordml" xmlns:wpg="http://schemas.microsoft.com/office/word/2010/wordprocessingGroup" xmlns:wpi="http://schemas.microsoft.com/office/word/2010/wordprocessingInk" xmlns:wne="http://schemas.microsoft.com/office/word/2006/wordml" xmlns:wps="http://schemas.microsoft.com/office/word/2010/wordprocessingShape" mc:Ignorable="w14 wp14">
   <w:body>
-    <w:p>
-      <w:pPr>
-        <w:jc w:val="center"/>
-      </w:pPr>
-      <w:r>
-        <w:rPr>
-          <w:b/>
-          <w:color w:val="1F3764"/>
-          <w:sz w:val="30"/>
-        </w:rPr>
-        <w:t>INFORME MENSUAL DE GESTIÓN</w:t>
-      </w:r>
-    </w:p>
     <w:p>
       <w:pPr>
         <w:jc w:val="center"/>
@@ -506,6 +493,8 @@
       </w:r>
     </w:p>
     <w:sectPr>
+      <w:headerReference w:type="default" r:id="rId9"/>
+      <w:footerReference w:type="default" r:id="rId10"/>
       <w:pgSz w:w="12240" w:h="15840"/>
       <w:pgMar w:top="1440" w:right="1800" w:bottom="1440" w:left="1800" w:header="720" w:footer="720" w:gutter="0"/>
       <w:cols w:space="720"/>
@@ -513,6 +502,223 @@
     </w:sectPr>
   </w:body>
 </w:document>
+</file>
+
+<file path=word/footer1.xml><?xml version="1.0" encoding="utf-8"?>
+<w:ftr xmlns:m="http://schemas.openxmlformats.org/officeDocument/2006/math" xmlns:mc="http://schemas.openxmlformats.org/markup-compatibility/2006" xmlns:mo="http://schemas.microsoft.com/office/mac/office/2008/main" xmlns:mv="urn:schemas-microsoft-com:mac:vml" xmlns:o="urn:schemas-microsoft-com:office:office" xmlns:r="http://schemas.openxmlformats.org/officeDocument/2006/relationships" xmlns:v="urn:schemas-microsoft-com:vml" xmlns:w10="urn:schemas-microsoft-com:office:word" xmlns:w14="http://schemas.microsoft.com/office/word/2010/wordml" xmlns:w="http://schemas.openxmlformats.org/wordprocessingml/2006/main" xmlns:wne="http://schemas.microsoft.com/office/word/2006/wordml" xmlns:wp14="http://schemas.microsoft.com/office/word/2010/wordprocessingDrawing" xmlns:wp="http://schemas.openxmlformats.org/drawingml/2006/wordprocessingDrawing" xmlns:wpc="http://schemas.microsoft.com/office/word/2010/wordprocessingCanvas" xmlns:wpg="http://schemas.microsoft.com/office/word/2010/wordprocessingGroup" xmlns:wpi="http://schemas.microsoft.com/office/word/2010/wordprocessingInk" xmlns:wps="http://schemas.microsoft.com/office/word/2010/wordprocessingShape" mc:Ignorable="w14 wp14">
+  <w:p>
+    <w:pPr>
+      <w:pStyle w:val="Footer"/>
+      <w:jc w:val="center"/>
+    </w:pPr>
+    <w:r>
+      <w:rPr>
+        <w:sz w:val="16"/>
+      </w:rPr>
+      <w:t>www.sanpedrodelosmilagros-antioquia.gov.co / Carrera 49A No.49-36 Parque principal - PBX. 8687039</w:t>
+    </w:r>
+  </w:p>
+  <w:p>
+    <w:pPr>
+      <w:jc w:val="center"/>
+    </w:pPr>
+    <w:r>
+      <w:rPr>
+        <w:sz w:val="16"/>
+      </w:rPr>
+      <w:t xml:space="preserve">E-mail: secgobierno@sanpedrodelosmilagros-antioquia.gov.co / Código Postal 051010 / Página </w:t>
+    </w:r>
+    <w:r>
+      <w:rPr>
+        <w:sz w:val="16"/>
+      </w:rPr>
+      <w:fldChar w:fldCharType="begin"/>
+      <w:instrText xml:space="preserve">PAGE</w:instrText>
+      <w:fldChar w:fldCharType="end"/>
+    </w:r>
+    <w:r>
+      <w:rPr>
+        <w:sz w:val="16"/>
+      </w:rPr>
+      <w:t xml:space="preserve"> de </w:t>
+    </w:r>
+    <w:r>
+      <w:rPr>
+        <w:sz w:val="16"/>
+      </w:rPr>
+      <w:fldChar w:fldCharType="begin"/>
+      <w:instrText xml:space="preserve">NUMPAGES</w:instrText>
+      <w:fldChar w:fldCharType="end"/>
+    </w:r>
+  </w:p>
+</w:ftr>
+</file>
+
+<file path=word/header1.xml><?xml version="1.0" encoding="utf-8"?>
+<w:hdr xmlns:m="http://schemas.openxmlformats.org/officeDocument/2006/math" xmlns:mc="http://schemas.openxmlformats.org/markup-compatibility/2006" xmlns:mo="http://schemas.microsoft.com/office/mac/office/2008/main" xmlns:mv="urn:schemas-microsoft-com:mac:vml" xmlns:o="urn:schemas-microsoft-com:office:office" xmlns:r="http://schemas.openxmlformats.org/officeDocument/2006/relationships" xmlns:v="urn:schemas-microsoft-com:vml" xmlns:w10="urn:schemas-microsoft-com:office:word" xmlns:w14="http://schemas.microsoft.com/office/word/2010/wordml" xmlns:w="http://schemas.openxmlformats.org/wordprocessingml/2006/main" xmlns:wne="http://schemas.microsoft.com/office/word/2006/wordml" xmlns:wp14="http://schemas.microsoft.com/office/word/2010/wordprocessingDrawing" xmlns:wp="http://schemas.openxmlformats.org/drawingml/2006/wordprocessingDrawing" xmlns:wpc="http://schemas.microsoft.com/office/word/2010/wordprocessingCanvas" xmlns:wpg="http://schemas.microsoft.com/office/word/2010/wordprocessingGroup" xmlns:wpi="http://schemas.microsoft.com/office/word/2010/wordprocessingInk" xmlns:wps="http://schemas.microsoft.com/office/word/2010/wordprocessingShape" mc:Ignorable="w14 wp14">
+  <w:p>
+    <w:pPr>
+      <w:pStyle w:val="Header"/>
+    </w:pPr>
+  </w:p>
+  <w:tbl>
+    <w:tblPr>
+      <w:tblW w:type="auto" w:w="0"/>
+      <w:tblLayout w:type="fixed"/>
+      <w:tblLook w:firstColumn="1" w:firstRow="1" w:lastColumn="0" w:lastRow="0" w:noHBand="0" w:noVBand="1" w:val="04A0"/>
+    </w:tblPr>
+    <w:tblGrid>
+      <w:gridCol w:w="4252"/>
+      <w:gridCol w:w="4252"/>
+      <w:gridCol w:w="1417"/>
+    </w:tblGrid>
+    <w:tr>
+      <w:tc>
+        <w:tcPr>
+          <w:tcW w:type="dxa" w:w="4252"/>
+          <w:vMerge w:val="restart"/>
+          <w:vAlign w:val="center"/>
+        </w:tcPr>
+        <w:p>
+          <w:pPr>
+            <w:jc w:val="center"/>
+          </w:pPr>
+          <w:r>
+            <w:rPr>
+              <w:sz w:val="18"/>
+            </w:rPr>
+            <w:t>ADMINISTRACIÓN MUNICIPAL</w:t>
+          </w:r>
+        </w:p>
+        <w:p>
+          <w:pPr>
+            <w:jc w:val="center"/>
+          </w:pPr>
+          <w:r>
+            <w:rPr>
+              <w:sz w:val="18"/>
+            </w:rPr>
+            <w:t>Secretaria de Educación y Desarrollo Social</w:t>
+          </w:r>
+        </w:p>
+      </w:tc>
+      <w:tc>
+        <w:tcPr>
+          <w:tcW w:type="dxa" w:w="4252"/>
+          <w:vMerge w:val="restart"/>
+          <w:vAlign w:val="center"/>
+        </w:tcPr>
+        <w:p>
+          <w:pPr>
+            <w:jc w:val="center"/>
+          </w:pPr>
+          <w:r>
+            <w:rPr>
+              <w:b/>
+              <w:sz w:val="24"/>
+            </w:rPr>
+            <w:t>INFORME MENSUAL DE GESTIÓN</w:t>
+          </w:r>
+        </w:p>
+      </w:tc>
+      <w:tc>
+        <w:tcPr>
+          <w:tcW w:type="dxa" w:w="1417"/>
+          <w:vMerge w:val="restart"/>
+          <w:vAlign w:val="center"/>
+        </w:tcPr>
+        <w:p>
+          <w:pPr>
+            <w:jc w:val="center"/>
+          </w:pPr>
+          <w:r>
+            <w:rPr>
+              <w:sz w:val="18"/>
+            </w:rPr>
+            <w:drawing>
+              <wp:inline xmlns:a="http://schemas.openxmlformats.org/drawingml/2006/main" xmlns:pic="http://schemas.openxmlformats.org/drawingml/2006/picture">
+                <wp:extent cx="756000" cy="756000"/>
+                <wp:docPr id="1" name="Picture 1"/>
+                <wp:cNvGraphicFramePr>
+                  <a:graphicFrameLocks noChangeAspect="1"/>
+                </wp:cNvGraphicFramePr>
+                <a:graphic>
+                  <a:graphicData uri="http://schemas.openxmlformats.org/drawingml/2006/picture">
+                    <pic:pic>
+                      <pic:nvPicPr>
+                        <pic:cNvPr id="0" name="escudo_municipio.jpg"/>
+                        <pic:cNvPicPr/>
+                      </pic:nvPicPr>
+                      <pic:blipFill>
+                        <a:blip r:embed="rId1"/>
+                        <a:stretch>
+                          <a:fillRect/>
+                        </a:stretch>
+                      </pic:blipFill>
+                      <pic:spPr>
+                        <a:xfrm>
+                          <a:off x="0" y="0"/>
+                          <a:ext cx="756000" cy="756000"/>
+                        </a:xfrm>
+                        <a:prstGeom prst="rect"/>
+                      </pic:spPr>
+                    </pic:pic>
+                  </a:graphicData>
+                </a:graphic>
+              </wp:inline>
+            </w:drawing>
+          </w:r>
+        </w:p>
+      </w:tc>
+    </w:tr>
+    <w:tr>
+      <w:tc>
+        <w:tcPr>
+          <w:tcW w:type="dxa" w:w="4252"/>
+          <w:vMerge/>
+        </w:tcPr>
+        <w:p/>
+      </w:tc>
+      <w:tc>
+        <w:tcPr>
+          <w:tcW w:type="dxa" w:w="4252"/>
+          <w:vMerge/>
+        </w:tcPr>
+        <w:p/>
+      </w:tc>
+      <w:tc>
+        <w:tcPr>
+          <w:tcW w:type="dxa" w:w="1417"/>
+          <w:vMerge/>
+        </w:tcPr>
+        <w:p/>
+      </w:tc>
+    </w:tr>
+    <w:tr>
+      <w:tc>
+        <w:tcPr>
+          <w:tcW w:type="dxa" w:w="4252"/>
+          <w:vMerge/>
+        </w:tcPr>
+        <w:p/>
+      </w:tc>
+      <w:tc>
+        <w:tcPr>
+          <w:tcW w:type="dxa" w:w="4252"/>
+          <w:vMerge/>
+        </w:tcPr>
+        <w:p/>
+      </w:tc>
+      <w:tc>
+        <w:tcPr>
+          <w:tcW w:type="dxa" w:w="1417"/>
+          <w:vMerge/>
+        </w:tcPr>
+        <w:p/>
+      </w:tc>
+    </w:tr>
+  </w:tbl>
+</w:hdr>
 </file>
 
 <file path=word/numbering.xml><?xml version="1.0" encoding="utf-8"?>

</xml_diff>

<commit_message>
Certificado de pago mensual, rendimiento del cliente y version 2.1.7
Cierra el certificado de pago mensual (pantalla + generador de plantilla)
que venia sin terminar de commits anteriores, y suma tres arreglos de
rendimiento/UX encontrados probando la app en vivo:

- Comprimir fotos ya no bloquea el hilo principal al editar una
  planeacion (planeacion_editor_screen.py) ni al guardar un usuario o su
  firma (editar_usuario_screen.py, que no usaba segundo plano en nada).
- Parche a CTkScrollbar (ctk_parches.py): agrupaba mal las actualizaciones
  de la barra de scroll al agregar filas, haciendo O(n^2) el redibujado de
  cualquier lista larga en las 16 pantallas que heredan de
  CTkScrollableFrame. Medido: ~35% mas rapido en listas de 20 filas.
- Inicio avisa "Cargando su resumen..." mientras trae los datos en vez de
  quedar estatico sin decir nada.

Sube APP_VERSION a 2.1.7 para el proximo instalador.

Co-Authored-By: Claude Sonnet 5 <noreply@anthropic.com>
</commit_message>
<xml_diff>
--- a/templates/informe_gestion.docx
+++ b/templates/informe_gestion.docx
@@ -513,7 +513,8 @@
     </w:pPr>
     <w:r>
       <w:rPr>
-        <w:sz w:val="16"/>
+        <w:rFonts w:ascii="Century Gothic" w:hAnsi="Century Gothic"/>
+        <w:sz w:val="18"/>
       </w:rPr>
       <w:t>www.sanpedrodelosmilagros-antioquia.gov.co / Carrera 49A No.49-36 Parque principal - PBX. 8687039</w:t>
     </w:r>
@@ -524,13 +525,15 @@
     </w:pPr>
     <w:r>
       <w:rPr>
-        <w:sz w:val="16"/>
+        <w:rFonts w:ascii="Century Gothic" w:hAnsi="Century Gothic"/>
+        <w:sz w:val="18"/>
       </w:rPr>
       <w:t xml:space="preserve">E-mail: secgobierno@sanpedrodelosmilagros-antioquia.gov.co / Código Postal 051010 / Página </w:t>
     </w:r>
     <w:r>
       <w:rPr>
-        <w:sz w:val="16"/>
+        <w:rFonts w:ascii="Century Gothic" w:hAnsi="Century Gothic"/>
+        <w:sz w:val="18"/>
       </w:rPr>
       <w:fldChar w:fldCharType="begin"/>
       <w:instrText xml:space="preserve">PAGE</w:instrText>
@@ -538,13 +541,15 @@
     </w:r>
     <w:r>
       <w:rPr>
-        <w:sz w:val="16"/>
+        <w:rFonts w:ascii="Century Gothic" w:hAnsi="Century Gothic"/>
+        <w:sz w:val="18"/>
       </w:rPr>
       <w:t xml:space="preserve"> de </w:t>
     </w:r>
     <w:r>
       <w:rPr>
-        <w:sz w:val="16"/>
+        <w:rFonts w:ascii="Century Gothic" w:hAnsi="Century Gothic"/>
+        <w:sz w:val="18"/>
       </w:rPr>
       <w:fldChar w:fldCharType="begin"/>
       <w:instrText xml:space="preserve">NUMPAGES</w:instrText>
@@ -585,6 +590,7 @@
           </w:pPr>
           <w:r>
             <w:rPr>
+              <w:rFonts w:ascii="Century Gothic" w:hAnsi="Century Gothic"/>
               <w:sz w:val="18"/>
             </w:rPr>
             <w:t>ADMINISTRACIÓN MUNICIPAL</w:t>
@@ -596,6 +602,7 @@
           </w:pPr>
           <w:r>
             <w:rPr>
+              <w:rFonts w:ascii="Century Gothic" w:hAnsi="Century Gothic"/>
               <w:sz w:val="18"/>
             </w:rPr>
             <w:t>Secretaria de Educación y Desarrollo Social</w:t>

</xml_diff>